<commit_message>
docs: Update Portuguese CV documents (PDF, DOCX, ODT).
</commit_message>
<xml_diff>
--- a/public/cv/cv-pt.docx
+++ b/public/cv/cv-pt.docx
@@ -330,33 +330,7 @@
           <w:szCs w:val="21"/>
           <w:u w:val="none"/>
         </w:rPr>
-        <w:t xml:space="preserve">Graduação Bacharel em </w:t>
-      </w:r>
-      <w:r>
-        <w:rPr>
-          <w:rStyle w:val="Hyperlink"/>
-          <w:rFonts w:eastAsia="Calibri" w:cs="Arial" w:ascii="Adwaita Sans" w:hAnsi="Adwaita Sans"/>
-          <w:b w:val="false"/>
-          <w:bCs w:val="false"/>
-          <w:color w:val="000000"/>
-          <w:sz w:val="21"/>
-          <w:szCs w:val="21"/>
-          <w:u w:val="none"/>
-        </w:rPr>
-        <w:t>Engenharia Elétrica</w:t>
-      </w:r>
-      <w:r>
-        <w:rPr>
-          <w:rStyle w:val="Hyperlink"/>
-          <w:rFonts w:eastAsia="Calibri" w:cs="Arial" w:ascii="Adwaita Sans" w:hAnsi="Adwaita Sans"/>
-          <w:b w:val="false"/>
-          <w:bCs w:val="false"/>
-          <w:color w:val="000000"/>
-          <w:sz w:val="21"/>
-          <w:szCs w:val="21"/>
-          <w:u w:val="none"/>
-        </w:rPr>
-        <w:t xml:space="preserve">, </w:t>
+        <w:t xml:space="preserve">Graduação Bacharel em Engenharia Elétrica, </w:t>
       </w:r>
       <w:r>
         <w:rPr>
@@ -456,19 +430,18 @@
           <w:sz w:val="21"/>
           <w:szCs w:val="21"/>
         </w:rPr>
-        <w:t>Pós-graduação Lato Sensu em Arquitetura de Software e Soluções</w:t>
-      </w:r>
-      <w:r>
-        <w:rPr>
-          <w:rStyle w:val="Strong"/>
-          <w:rFonts w:cs="Arial" w:ascii="Adwaita Sans" w:hAnsi="Adwaita Sans"/>
-          <w:b w:val="false"/>
-          <w:bCs w:val="false"/>
-          <w:color w:val="000000"/>
-          <w:sz w:val="21"/>
-          <w:szCs w:val="21"/>
-        </w:rPr>
-        <w:br/>
+        <w:t xml:space="preserve">Pós-graduação Lato Sensu em Arquitetura de Software e Soluções, </w:t>
+      </w:r>
+      <w:r>
+        <w:rPr>
+          <w:rStyle w:val="Strong"/>
+          <w:rFonts w:cs="Arial" w:ascii="Adwaita Sans" w:hAnsi="Adwaita Sans"/>
+          <w:b w:val="false"/>
+          <w:bCs w:val="false"/>
+          <w:color w:val="000000"/>
+          <w:sz w:val="21"/>
+          <w:szCs w:val="21"/>
+        </w:rPr>
         <w:t>Fev 2025 – Fev 2026</w:t>
       </w:r>
     </w:p>
@@ -496,16 +469,7 @@
           <w:sz w:val="21"/>
           <w:szCs w:val="21"/>
         </w:rPr>
-        <w:t>Tecnólogo em Análise e Desenvolvimento de Sistemas</w:t>
-      </w:r>
-      <w:r>
-        <w:rPr>
-          <w:rFonts w:cs="Arial" w:ascii="Adwaita Sans" w:hAnsi="Adwaita Sans"/>
-          <w:color w:val="000000"/>
-          <w:sz w:val="21"/>
-          <w:szCs w:val="21"/>
-        </w:rPr>
-        <w:br/>
+        <w:t xml:space="preserve">Tecnólogo em Análise e Desenvolvimento de Sistemas, </w:t>
       </w:r>
       <w:r>
         <w:rPr>
@@ -702,8 +666,8 @@
         </w:rPr>
         <w:br/>
       </w:r>
-      <w:bookmarkStart w:id="1" w:name="__DdeLink__498_1516522722"/>
-      <w:bookmarkStart w:id="2" w:name="__DdeLink__495_1516522722"/>
+      <w:bookmarkStart w:id="1" w:name="__DdeLink__495_1516522722"/>
+      <w:bookmarkStart w:id="2" w:name="__DdeLink__498_1516522722"/>
       <w:bookmarkEnd w:id="1"/>
       <w:bookmarkEnd w:id="2"/>
       <w:r>
@@ -726,8 +690,8 @@
         <w:spacing w:lineRule="auto" w:line="259"/>
         <w:rPr/>
       </w:pPr>
-      <w:bookmarkStart w:id="3" w:name="__DdeLink__425_1516522722"/>
-      <w:bookmarkStart w:id="4" w:name="__DdeLink__422_1516522722"/>
+      <w:bookmarkStart w:id="3" w:name="__DdeLink__422_1516522722"/>
+      <w:bookmarkStart w:id="4" w:name="__DdeLink__425_1516522722"/>
       <w:r>
         <w:rPr>
           <w:rStyle w:val="Strong"/>
@@ -753,8 +717,8 @@
         <w:ind w:hanging="283" w:start="709"/>
         <w:rPr/>
       </w:pPr>
-      <w:bookmarkStart w:id="5" w:name="__DdeLink__490_1516522722"/>
-      <w:bookmarkStart w:id="6" w:name="__DdeLink__493_1516522722"/>
+      <w:bookmarkStart w:id="5" w:name="__DdeLink__493_1516522722"/>
+      <w:bookmarkStart w:id="6" w:name="__DdeLink__490_1516522722"/>
       <w:r>
         <w:rPr>
           <w:rStyle w:val="Strong"/>

</xml_diff>